<commit_message>
Update seluruh tugas praktikum ASD Semester 2
</commit_message>
<xml_diff>
--- a/minggu2/LAPORAN PRAKTIKUM-ASD-WEEK-2.docx
+++ b/minggu2/LAPORAN PRAKTIKUM-ASD-WEEK-2.docx
@@ -48,24 +48,12 @@
     </w:p>
     <w:p>
       <w:r>
-        <w:rPr>
-          <w:b/>
-        </w:rPr>
-        <w:t xml:space="preserve">1. Dua karakteristik Class/Object: </w:t>
-      </w:r>
-      <w:r>
-        <w:t>Sebuah class atau object memiliki dua elemen utama, yaitu Atribut (berfungsi untuk menyimpan data atau state) dan Method (berfungsi sebagai aksi atau tingkah laku dari objek tersebut).</w:t>
+        <w:t>1. Dua karakteristik Class/Object: Sebuah class atau object memiliki dua elemen utama, yakni Atribut (berfungsi untuk menyimpan data atau state) dan Method (berfungsi sebagai aksi atau tingkah laku dari objek tersebut).</w:t>
       </w:r>
     </w:p>
     <w:p>
       <w:r>
-        <w:rPr>
-          <w:b/>
-        </w:rPr>
-        <w:t xml:space="preserve">2. Atribut class Mahasiswa: </w:t>
-      </w:r>
-      <w:r>
-        <w:t>Pada class Mahasiswa ini, terdapat 4 buah atribut yang digunakan, yaitu:</w:t>
+        <w:t>2. Atribut class Mahasiswa: Pada class Mahasiswa ini, terdapat 4 buah atribut yang digunakan, yakni:</w:t>
       </w:r>
     </w:p>
     <w:p>
@@ -106,13 +94,7 @@
     </w:p>
     <w:p>
       <w:r>
-        <w:rPr>
-          <w:b/>
-        </w:rPr>
-        <w:t xml:space="preserve">3. Method class Mahasiswa: </w:t>
-      </w:r>
-      <w:r>
-        <w:t>Terdapat 4 method yang didefinisikan di dalam class ini, yaitu:</w:t>
+        <w:t>3. Method class Mahasiswa: Terdapat 4 method yang didefinisikan di dalam class ini, yakni:</w:t>
       </w:r>
     </w:p>
     <w:p>
@@ -153,13 +135,7 @@
     </w:p>
     <w:p>
       <w:r>
-        <w:rPr>
-          <w:b/>
-        </w:rPr>
-        <w:t xml:space="preserve">4. Modifikasi method updateIpk(): </w:t>
-      </w:r>
-      <w:r>
-        <w:t>Agar nilai IPK yang dimasukkan valid, ditambahkan pengecekan menggunakan kondisi if (nilaiIpkBaru &gt;= 0.0 &amp;&amp; nilaiIpkBaru &lt;= 4.0). Jika nilai parameter berada dalam rentang tersebut, nilai IPK akan diperbarui. Namun jika di luar rentang, program akan mencetak pesan peringatan bahwa IPK tidak valid.</w:t>
+        <w:t>4. Modifikasi method updateIpk(): Agar nilai IPK yang dimasukkan valid, ditambahkan pengecekan memakai kondisi if (nilaiIpkBaru &gt;= 0.0 &amp;&amp; nilaiIpkBaru &lt;= 4.0). Jika nilai parameter berada dalam rentang tersebut, nilai IPK akan diperbarui. Namun jika di luar rentang, program akan mencetak pesan peringatan bahwa IPK tidak valid.</w:t>
       </w:r>
     </w:p>
     <w:p>
@@ -191,13 +167,7 @@
     </w:p>
     <w:p>
       <w:r>
-        <w:rPr>
-          <w:b/>
-        </w:rPr>
-        <w:t xml:space="preserve">5. Cara kerja method nilaiKinerja(): </w:t>
-      </w:r>
-      <w:r>
-        <w:t>Method ini digunakan untuk mengevaluasi predikat kinerja mahasiswa berdasarkan atribut IPK. Prosesnya menggunakan struktur logika percabangan if-else bertingkat: jika IPK &gt;= 3.5 maka predikatnya Sangat Baik, &gt;= 3.0 Baik, &gt;= 2.0 Cukup, dan di bawah itu mendapat predikat Kurang. Hasil evaluasi tersebut kemudian dikembalikan (return) dalam bentuk teks (String).</w:t>
+        <w:t>5. Metode kerja method nilaiKinerja(): Method ini digunakan untuk mengevaluasi predikat kinerja mahasiswa berdasarkan atribut IPK. Prosesnya memakai struktur logika percabangan if-else bertingkat: jika IPK &gt;= 3.5 maka predikatnya Sangat Baik, &gt;= 3.0 Baik, &gt;= 2.0 Cukup, dan di bawah itu mendapat predikat Kurang. Hasil evaluasi tersebut selanjutnya dikembalikan (return) dalam bentuk teks (String).</w:t>
       </w:r>
     </w:p>
     <w:p>
@@ -213,35 +183,17 @@
     </w:p>
     <w:p>
       <w:r>
-        <w:rPr>
-          <w:b/>
-        </w:rPr>
-        <w:t xml:space="preserve">1. Baris kode instansiasi: </w:t>
-      </w:r>
-      <w:r>
-        <w:t>Baris kode untuk proses instansiasi adalah: Mahasiswa29 mhs1 = new Mahasiswa29();. Objek yang dihasilkan dari instansiasi ini bernama mhs1.</w:t>
+        <w:t>1. Baris kode instansiasi: Baris kode untuk proses instansiasi merupakan: Mahasiswa29 mhs1 = new Mahasiswa29();. Objek yang dihasilkan dari instansiasi ini bernama mhs1.</w:t>
       </w:r>
     </w:p>
     <w:p>
       <w:r>
-        <w:rPr>
-          <w:b/>
-        </w:rPr>
-        <w:t xml:space="preserve">2. Cara mengakses atribut dan method: </w:t>
-      </w:r>
-      <w:r>
-        <w:t>Pengaksesan atribut dan method dilakukan dengan menambahkan operator titik (.) setelah nama objeknya. Contoh penggunaannya adalah mhs1.nama untuk mengakses atribut, dan mhs1.tampilkanInformasi() untuk mengeksekusi method.</w:t>
+        <w:t>2. Metode mengakses atribut dan method: Pengaksesan atribut dan method dilakukan dengan menambahkan operator titik (.) setelah nama objeknya. Contoh penggunaannya merupakan mhs1.nama untuk mengakses atribut, dan mhs1.tampilkanInformasi() untuk mengeksekusi method.</w:t>
       </w:r>
     </w:p>
     <w:p>
       <w:r>
-        <w:rPr>
-          <w:b/>
-        </w:rPr>
-        <w:t xml:space="preserve">3. Mengapa output pemanggilan pertama dan kedua berbeda? </w:t>
-      </w:r>
-      <w:r>
-        <w:t>Perbedaan output terjadi karena sebelum perintah cetak yang kedua, program mengeksekusi method ubahKelas("SI 2K") dan updateIpk(3.60). Eksekusi tersebut mengubah data (state) yang tersimpan di dalam objek mhs1, sehingga data yang ditampilkan menjadi data yang terbaru.</w:t>
+        <w:t>3. Mengapa output pemanggilan pertama dan kedua berbeda? Perbedaan output terjadi dikarenakan sebelum perintah cetak yang kedua, program mengeksekusi method ubahKelas("SI 2K") dan updateIpk(3.60). Eksekusi tersebut mengubah data (state) yang tersimpan di dalam objek mhs1, maka dari itu data yang ditampilkan menjadi data yang terbaru.</w:t>
       </w:r>
     </w:p>
     <w:p>
@@ -315,35 +267,17 @@
     </w:p>
     <w:p>
       <w:r>
-        <w:rPr>
-          <w:b/>
-        </w:rPr>
-        <w:t xml:space="preserve">3. Jika konstruktor default dihapus: </w:t>
-      </w:r>
-      <w:r>
-        <w:t>Program akan mengalami error pada saat dikompilasi, tepatnya pada baris Mahasiswa29 mhs1 = new Mahasiswa29();. Alasannya, secara default Java akan menyediakan konstruktor kosong secara otomatis jika kita tidak membuat konstruktor sama sekali. Namun, karena kita sudah membuat satu konstruktor berparameter, Java tidak lagi menyediakannya. Oleh karena itu, jika kita masih membutuhkan konstruktor kosong, kita harus mendeklarasikannya secara manual.</w:t>
+        <w:t>3. Jika konstruktor default dihapus: Program akan mengalami error pada saat dikompilasi, tepatnya pada baris Mahasiswa29 mhs1 = new Mahasiswa29();. Alasannya, secara default Java akan menyediakan konstruktor kosong secara otomatis jika kita tidak membuat konstruktor sama sekali. Namun, dikarenakan kita sudah membuat satu konstruktor berparameter, Java tidak lagi menyediakannya. Oleh dikarenakan itu, jika kita masih membutuhkan konstruktor kosong, kita harus mendeklarasikannya secara manual.</w:t>
       </w:r>
     </w:p>
     <w:p>
       <w:r>
-        <w:rPr>
-          <w:b/>
-        </w:rPr>
-        <w:t xml:space="preserve">4. Apakah method harus dipanggil berurutan? </w:t>
-      </w:r>
-      <w:r>
-        <w:t>Tidak harus berurutan. Pemanggilan method dapat dilakukan kapan saja sesuai dengan kebutuhan dan alur logika program yang sedang dirancang.</w:t>
+        <w:t>4. Apakah method harus dipanggil berurutan? Tidak harus berurutan. Pemanggilan method bisa dilakukan kapan saja sesuai dengan kebutuhan dan alur logika program yang sedang dirancang.</w:t>
       </w:r>
     </w:p>
     <w:p>
       <w:r>
-        <w:rPr>
-          <w:b/>
-        </w:rPr>
-        <w:t xml:space="preserve">5. Pembuatan objek menggunakan nama sendiri: </w:t>
-      </w:r>
-      <w:r>
-        <w:t>Implementasi objek baru dengan data pribadi (nama: Wildan Dwi Triatna Kusuma dan NIM: 254107020030) telah dilakukan di dalam program Main menggunakan konstruktor berparameter.</w:t>
+        <w:t>5. Pembuatan objek memakai nama sendiri: Implementasi objek baru dengan data pribadi (nama: Wildan Dwi Triatna Kusuma dan NIM: 254107020030) telah dilakukan di dalam program Main memakai konstruktor berparameter.</w:t>
       </w:r>
     </w:p>
     <w:p>
@@ -359,13 +293,7 @@
     </w:p>
     <w:p>
       <w:r>
-        <w:rPr>
-          <w:b/>
-        </w:rPr>
-        <w:t xml:space="preserve">1. Hasil Program Class MataKuliah: </w:t>
-      </w:r>
-      <w:r>
-        <w:t>Berikut adalah hasil eksekusi dari program MataKuliah29, yang menampilkan uji coba penambahan serta pengurangan jam kuliah beserta validasinya.</w:t>
+        <w:t>1. Hasil Program Class MataKuliah: Berikut merupakan hasil eksekusi dari program MataKuliah29, yang menampilkan uji coba penambahan serta pengurangan jam kuliah beserta validasinya.</w:t>
       </w:r>
     </w:p>
     <w:p>
@@ -406,13 +334,7 @@
     </w:p>
     <w:p>
       <w:r>
-        <w:rPr>
-          <w:b/>
-        </w:rPr>
-        <w:t xml:space="preserve">2. Hasil Program Class Dosen: </w:t>
-      </w:r>
-      <w:r>
-        <w:t>Berikut adalah hasil eksekusi dari program Dosen29, yang menampilkan fungsi perubahan status aktif dosen serta perhitungan masa kerja berdasarkan tahun saat ini.</w:t>
+        <w:t>2. Hasil Program Class Dosen: Berikut merupakan hasil eksekusi dari program Dosen29, yang menampilkan fungsi perubahan status aktif dosen serta perhitungan masa kerja berdasarkan tahun saat ini.</w:t>
       </w:r>
     </w:p>
     <w:p>

</xml_diff>